<commit_message>
Add D. Sukhbaatar commander award proposal with badge and certificate designs
Top-tier cadet award named after D. Sukhbaatar: criteria, selection
procedure, wear and revocation rules, shield-shaped badge (front,
reverse, miniature, case) and certificate template, designed to stay
distinct from the state Order of Sukhbaatar. The insignia proposal now
lists it as the highest award.

Co-Authored-By: Claude Opus 5.5 <noreply@anthropic.com>
Claude-Session: https://claude.ai/code/session_01L8UQv8en9juEtmuFXTcboL
</commit_message>
<xml_diff>
--- a/ubhis-sonsogchiin-horoo/ubhis_sonsogchiin_horoo_yalgah_temdeg.docx
+++ b/ubhis-sonsogchiin-horoo/ubhis_sonsogchiin_horoo_yalgah_temdeg.docx
@@ -331,10 +331,20 @@
           <w:b/>
           <w:bCs/>
         </w:rPr>
-        <w:t xml:space="preserve">Шагналын тэмдэг 4 бүлэгтэй:</w:t>
-      </w:r>
-      <w:r>
-        <w:t xml:space="preserve"> (1) семестрийн жагсаалтын тэмдэг — Эрдэм, Удирдах, Чадал, Захирлын жагсаалт; (2) жилийн ба тусгай тэмдэг — Шилдэг удирдагч, Нэр төр, Эх оронч, Удирдах албаны тэмдэг, Хорооны ахлах сонсогч асны тэмдэг; (3) нэгжийн шагнал — «Шилдэг рот», Хорооны аваргын туг; (4) төгсөлтийн шагнал — Хүндэт сэлэм, Төгсөлтийн гавьяаны тэмдэг (алт, мөнгө, хүрэл).</w:t>
+        <w:t xml:space="preserve">Шагналын тэмдэг:</w:t>
+      </w:r>
+      <w:r>
+        <w:t xml:space="preserve"> хамгийн дээд нь </w:t>
+      </w:r>
+      <w:r>
+        <w:rPr>
+          <w:b/>
+          <w:bCs/>
+        </w:rPr>
+        <w:t xml:space="preserve">Д.Сүхбаатар жанжны нэрэмжит шагнал</w:t>
+      </w:r>
+      <w:r>
+        <w:t xml:space="preserve"> (жилд 1, 3 дугаар сарын 18-нд олгоно; журам, загварыг тусдаа баримтад гаргасан). Түүнээс доош 4 бүлэг: (1) семестрийн жагсаалтын тэмдэг — Эрдэм, Удирдах, Чадал, Захирлын жагсаалт; (2) жилийн ба тусгай тэмдэг — Шилдэг удирдагч, Нэр төр, Эх оронч, Удирдах албаны тэмдэг, Хорооны ахлах сонсогч асны тэмдэг; (3) нэгжийн шагнал — «Шилдэг рот», Хорооны аваргын туг; (4) төгсөлтийн шагнал — Хүндэт сэлэм, Төгсөлтийн гавьяаны тэмдэг (алт, мөнгө, хүрэл).</w:t>
       </w:r>
     </w:p>
     <w:p>
@@ -7203,7 +7213,7 @@
                 <w:sz w:val="19"/>
                 <w:szCs w:val="19"/>
               </w:rPr>
-              <w:t xml:space="preserve">I. Семестрийн жагсаалт</w:t>
+              <w:t xml:space="preserve">Дээд шагнал</w:t>
             </w:r>
           </w:p>
         </w:tc>
@@ -7231,12 +7241,21 @@
             </w:pPr>
             <w:r>
               <w:rPr>
-                <w:b w:val="false"/>
-                <w:bCs w:val="false"/>
-                <w:sz w:val="19"/>
-                <w:szCs w:val="19"/>
-              </w:rPr>
-              <w:t xml:space="preserve">Эрдмийн, Удирдах, Бие бялдрын, Захирлын жагсаалтын тэмдэг</w:t>
+                <w:b/>
+                <w:bCs/>
+                <w:sz w:val="19"/>
+                <w:szCs w:val="19"/>
+              </w:rPr>
+              <w:t xml:space="preserve">Д.Сүхбаатар жанжны нэрэмжит шагнал</w:t>
+            </w:r>
+            <w:r>
+              <w:rPr>
+                <w:b w:val="false"/>
+                <w:bCs w:val="false"/>
+                <w:sz w:val="19"/>
+                <w:szCs w:val="19"/>
+              </w:rPr>
+              <w:t xml:space="preserve"> (тусдаа журам, загвартай)</w:t>
             </w:r>
           </w:p>
         </w:tc>
@@ -7269,7 +7288,7 @@
                 <w:sz w:val="19"/>
                 <w:szCs w:val="19"/>
               </w:rPr>
-              <w:t xml:space="preserve">Семестр бүр</w:t>
+              <w:t xml:space="preserve">Жил бүр, 3-р сарын 18</w:t>
             </w:r>
           </w:p>
         </w:tc>
@@ -7302,7 +7321,7 @@
                 <w:sz w:val="19"/>
                 <w:szCs w:val="19"/>
               </w:rPr>
-              <w:t xml:space="preserve">Хорооны захирагч (жагсаалтыг батална)</w:t>
+              <w:t xml:space="preserve">ҮБХИС-ийн захирал</w:t>
             </w:r>
           </w:p>
         </w:tc>
@@ -7341,7 +7360,7 @@
                 <w:sz w:val="19"/>
                 <w:szCs w:val="19"/>
               </w:rPr>
-              <w:t xml:space="preserve">II. Жилийн ба тусгай</w:t>
+              <w:t xml:space="preserve">I. Семестрийн жагсаалт</w:t>
             </w:r>
           </w:p>
         </w:tc>
@@ -7375,7 +7394,7 @@
                 <w:sz w:val="19"/>
                 <w:szCs w:val="19"/>
               </w:rPr>
-              <w:t xml:space="preserve">Шилдэг сонсогч удирдагч, Нэр төрийн, Эх оронч сонсогчийн, Удирдах албаны, Хорооны ахлах сонсогч асны тэмдэг</w:t>
+              <w:t xml:space="preserve">Эрдмийн, Удирдах, Бие бялдрын, Захирлын жагсаалтын тэмдэг</w:t>
             </w:r>
           </w:p>
         </w:tc>
@@ -7409,7 +7428,7 @@
                 <w:sz w:val="19"/>
                 <w:szCs w:val="19"/>
               </w:rPr>
-              <w:t xml:space="preserve">Жил бүр / тухай бүр</w:t>
+              <w:t xml:space="preserve">Семестр бүр</w:t>
             </w:r>
           </w:p>
         </w:tc>
@@ -7443,7 +7462,7 @@
                 <w:sz w:val="19"/>
                 <w:szCs w:val="19"/>
               </w:rPr>
-              <w:t xml:space="preserve">Хорооны захирагч, зөвлөлүүдийн санал</w:t>
+              <w:t xml:space="preserve">Хорооны захирагч (жагсаалтыг батална)</w:t>
             </w:r>
           </w:p>
         </w:tc>
@@ -7482,7 +7501,7 @@
                 <w:sz w:val="19"/>
                 <w:szCs w:val="19"/>
               </w:rPr>
-              <w:t xml:space="preserve">III. Нэгжийн шагнал</w:t>
+              <w:t xml:space="preserve">II. Жилийн ба тусгай</w:t>
             </w:r>
           </w:p>
         </w:tc>
@@ -7515,7 +7534,7 @@
                 <w:sz w:val="19"/>
                 <w:szCs w:val="19"/>
               </w:rPr>
-              <w:t xml:space="preserve">«Шилдэг рот»-ын тууз, тэмдэг; Хорооны аваргын туг</w:t>
+              <w:t xml:space="preserve">Шилдэг сонсогч удирдагч, Нэр төрийн, Эх оронч сонсогчийн, Удирдах албаны, Хорооны ахлах сонсогч асны тэмдэг</w:t>
             </w:r>
           </w:p>
         </w:tc>
@@ -7548,7 +7567,7 @@
                 <w:sz w:val="19"/>
                 <w:szCs w:val="19"/>
               </w:rPr>
-              <w:t xml:space="preserve">Семестр / жил</w:t>
+              <w:t xml:space="preserve">Жил бүр / тухай бүр</w:t>
             </w:r>
           </w:p>
         </w:tc>
@@ -7581,7 +7600,7 @@
                 <w:sz w:val="19"/>
                 <w:szCs w:val="19"/>
               </w:rPr>
-              <w:t xml:space="preserve">Хорооны захирагч</w:t>
+              <w:t xml:space="preserve">Хорооны захирагч, зөвлөлүүдийн санал</w:t>
             </w:r>
           </w:p>
         </w:tc>
@@ -7620,6 +7639,147 @@
                 <w:sz w:val="19"/>
                 <w:szCs w:val="19"/>
               </w:rPr>
+              <w:t xml:space="preserve">III. Нэгжийн шагнал</w:t>
+            </w:r>
+          </w:p>
+        </w:tc>
+        <w:tc>
+          <w:tcPr>
+            <w:tcW w:type="dxa" w:w="3900"/>
+            <w:tcBorders>
+              <w:top w:val="single" w:color="A9B1BD" w:sz="4"/>
+              <w:left w:val="single" w:color="A9B1BD" w:sz="4"/>
+              <w:bottom w:val="single" w:color="A9B1BD" w:sz="4"/>
+              <w:right w:val="single" w:color="A9B1BD" w:sz="4"/>
+            </w:tcBorders>
+            <w:shd w:fill="F7F8FA" w:color="auto" w:val="clear"/>
+            <w:tcMar>
+              <w:top w:type="dxa" w:w="70"/>
+              <w:left w:type="dxa" w:w="100"/>
+              <w:bottom w:type="dxa" w:w="70"/>
+              <w:right w:type="dxa" w:w="100"/>
+            </w:tcMar>
+            <w:vAlign w:val="top"/>
+          </w:tcPr>
+          <w:p>
+            <w:pPr>
+              <w:spacing w:after="40" w:line="264"/>
+              <w:jc w:val="left"/>
+            </w:pPr>
+            <w:r>
+              <w:rPr>
+                <w:b w:val="false"/>
+                <w:bCs w:val="false"/>
+                <w:sz w:val="19"/>
+                <w:szCs w:val="19"/>
+              </w:rPr>
+              <w:t xml:space="preserve">«Шилдэг рот»-ын тууз, тэмдэг; Хорооны аваргын туг</w:t>
+            </w:r>
+          </w:p>
+        </w:tc>
+        <w:tc>
+          <w:tcPr>
+            <w:tcW w:type="dxa" w:w="1500"/>
+            <w:tcBorders>
+              <w:top w:val="single" w:color="A9B1BD" w:sz="4"/>
+              <w:left w:val="single" w:color="A9B1BD" w:sz="4"/>
+              <w:bottom w:val="single" w:color="A9B1BD" w:sz="4"/>
+              <w:right w:val="single" w:color="A9B1BD" w:sz="4"/>
+            </w:tcBorders>
+            <w:shd w:fill="F7F8FA" w:color="auto" w:val="clear"/>
+            <w:tcMar>
+              <w:top w:type="dxa" w:w="70"/>
+              <w:left w:type="dxa" w:w="100"/>
+              <w:bottom w:type="dxa" w:w="70"/>
+              <w:right w:type="dxa" w:w="100"/>
+            </w:tcMar>
+            <w:vAlign w:val="top"/>
+          </w:tcPr>
+          <w:p>
+            <w:pPr>
+              <w:spacing w:after="40" w:line="264"/>
+              <w:jc w:val="left"/>
+            </w:pPr>
+            <w:r>
+              <w:rPr>
+                <w:b w:val="false"/>
+                <w:bCs w:val="false"/>
+                <w:sz w:val="19"/>
+                <w:szCs w:val="19"/>
+              </w:rPr>
+              <w:t xml:space="preserve">Семестр / жил</w:t>
+            </w:r>
+          </w:p>
+        </w:tc>
+        <w:tc>
+          <w:tcPr>
+            <w:tcW w:type="dxa" w:w="2238"/>
+            <w:tcBorders>
+              <w:top w:val="single" w:color="A9B1BD" w:sz="4"/>
+              <w:left w:val="single" w:color="A9B1BD" w:sz="4"/>
+              <w:bottom w:val="single" w:color="A9B1BD" w:sz="4"/>
+              <w:right w:val="single" w:color="A9B1BD" w:sz="4"/>
+            </w:tcBorders>
+            <w:shd w:fill="F7F8FA" w:color="auto" w:val="clear"/>
+            <w:tcMar>
+              <w:top w:type="dxa" w:w="70"/>
+              <w:left w:type="dxa" w:w="100"/>
+              <w:bottom w:type="dxa" w:w="70"/>
+              <w:right w:type="dxa" w:w="100"/>
+            </w:tcMar>
+            <w:vAlign w:val="top"/>
+          </w:tcPr>
+          <w:p>
+            <w:pPr>
+              <w:spacing w:after="40" w:line="264"/>
+              <w:jc w:val="left"/>
+            </w:pPr>
+            <w:r>
+              <w:rPr>
+                <w:b w:val="false"/>
+                <w:bCs w:val="false"/>
+                <w:sz w:val="19"/>
+                <w:szCs w:val="19"/>
+              </w:rPr>
+              <w:t xml:space="preserve">Хорооны захирагч</w:t>
+            </w:r>
+          </w:p>
+        </w:tc>
+      </w:tr>
+      <w:tr>
+        <w:trPr>
+          <w:cantSplit/>
+        </w:trPr>
+        <w:tc>
+          <w:tcPr>
+            <w:tcW w:type="dxa" w:w="2000"/>
+            <w:tcBorders>
+              <w:top w:val="single" w:color="A9B1BD" w:sz="4"/>
+              <w:left w:val="single" w:color="A9B1BD" w:sz="4"/>
+              <w:bottom w:val="single" w:color="A9B1BD" w:sz="4"/>
+              <w:right w:val="single" w:color="A9B1BD" w:sz="4"/>
+            </w:tcBorders>
+            <w:shd w:fill="F6E7B4" w:color="auto" w:val="clear"/>
+            <w:tcMar>
+              <w:top w:type="dxa" w:w="70"/>
+              <w:left w:type="dxa" w:w="100"/>
+              <w:bottom w:type="dxa" w:w="70"/>
+              <w:right w:type="dxa" w:w="100"/>
+            </w:tcMar>
+            <w:vAlign w:val="top"/>
+          </w:tcPr>
+          <w:p>
+            <w:pPr>
+              <w:spacing w:after="40" w:line="264"/>
+              <w:jc w:val="left"/>
+            </w:pPr>
+            <w:r>
+              <w:rPr>
+                <w:b/>
+                <w:bCs/>
+                <w:sz w:val="19"/>
+                <w:szCs w:val="19"/>
+              </w:rPr>
               <w:t xml:space="preserve">IV. Төгсөлтийн шагнал</w:t>
             </w:r>
           </w:p>
@@ -7633,7 +7793,6 @@
               <w:bottom w:val="single" w:color="A9B1BD" w:sz="4"/>
               <w:right w:val="single" w:color="A9B1BD" w:sz="4"/>
             </w:tcBorders>
-            <w:shd w:fill="F7F8FA" w:color="auto" w:val="clear"/>
             <w:tcMar>
               <w:top w:type="dxa" w:w="70"/>
               <w:left w:type="dxa" w:w="100"/>
@@ -7667,7 +7826,6 @@
               <w:bottom w:val="single" w:color="A9B1BD" w:sz="4"/>
               <w:right w:val="single" w:color="A9B1BD" w:sz="4"/>
             </w:tcBorders>
-            <w:shd w:fill="F7F8FA" w:color="auto" w:val="clear"/>
             <w:tcMar>
               <w:top w:type="dxa" w:w="70"/>
               <w:left w:type="dxa" w:w="100"/>
@@ -7701,7 +7859,6 @@
               <w:bottom w:val="single" w:color="A9B1BD" w:sz="4"/>
               <w:right w:val="single" w:color="A9B1BD" w:sz="4"/>
             </w:tcBorders>
-            <w:shd w:fill="F7F8FA" w:color="auto" w:val="clear"/>
             <w:tcMar>
               <w:top w:type="dxa" w:w="70"/>
               <w:left w:type="dxa" w:w="100"/>
@@ -9733,6 +9890,26 @@
           <w:b/>
           <w:bCs/>
         </w:rPr>
+        <w:t xml:space="preserve">Д.Сүхбаатар жанжны нэрэмжит шагнал</w:t>
+      </w:r>
+      <w:r>
+        <w:t xml:space="preserve"> — Сонсогчийн хорооны хамгийн дээд шагнал. Шалгуур, шалгаруулах журам, тэмдэг, өргөмжлөлийн загварыг «Д.Сүхбаатар жанжны нэрэмжит шагнал» баримтад дэлгэрэнгүй гаргасан.</w:t>
+      </w:r>
+    </w:p>
+    <w:p>
+      <w:pPr>
+        <w:pStyle w:val="ListParagraph"/>
+        <w:numPr>
+          <w:ilvl w:val="0"/>
+          <w:numId w:val="2"/>
+        </w:numPr>
+        <w:spacing w:after="60" w:line="288"/>
+      </w:pPr>
+      <w:r>
+        <w:rPr>
+          <w:b/>
+          <w:bCs/>
+        </w:rPr>
         <w:t xml:space="preserve">Хүндэт сэлэм</w:t>
       </w:r>
       <w:r>
@@ -11291,6 +11468,146 @@
                 <w:sz w:val="19"/>
                 <w:szCs w:val="19"/>
               </w:rPr>
+              <w:t xml:space="preserve">Д.Сүхбаатар жанжны нэрэмжит шагнал</w:t>
+            </w:r>
+          </w:p>
+        </w:tc>
+        <w:tc>
+          <w:tcPr>
+            <w:tcW w:type="dxa" w:w="2000"/>
+            <w:tcBorders>
+              <w:top w:val="single" w:color="A9B1BD" w:sz="4"/>
+              <w:left w:val="single" w:color="A9B1BD" w:sz="4"/>
+              <w:bottom w:val="single" w:color="A9B1BD" w:sz="4"/>
+              <w:right w:val="single" w:color="A9B1BD" w:sz="4"/>
+            </w:tcBorders>
+            <w:shd w:fill="F7F8FA" w:color="auto" w:val="clear"/>
+            <w:tcMar>
+              <w:top w:type="dxa" w:w="70"/>
+              <w:left w:type="dxa" w:w="100"/>
+              <w:bottom w:type="dxa" w:w="70"/>
+              <w:right w:type="dxa" w:w="100"/>
+            </w:tcMar>
+            <w:vAlign w:val="top"/>
+          </w:tcPr>
+          <w:p>
+            <w:pPr>
+              <w:spacing w:after="40" w:line="264"/>
+              <w:jc w:val="center"/>
+            </w:pPr>
+            <w:r>
+              <w:rPr>
+                <w:b w:val="false"/>
+                <w:bCs w:val="false"/>
+                <w:sz w:val="19"/>
+                <w:szCs w:val="19"/>
+              </w:rPr>
+              <w:t xml:space="preserve">Жижиг тэмдэг</w:t>
+            </w:r>
+          </w:p>
+        </w:tc>
+        <w:tc>
+          <w:tcPr>
+            <w:tcW w:type="dxa" w:w="2000"/>
+            <w:tcBorders>
+              <w:top w:val="single" w:color="A9B1BD" w:sz="4"/>
+              <w:left w:val="single" w:color="A9B1BD" w:sz="4"/>
+              <w:bottom w:val="single" w:color="A9B1BD" w:sz="4"/>
+              <w:right w:val="single" w:color="A9B1BD" w:sz="4"/>
+            </w:tcBorders>
+            <w:shd w:fill="F7F8FA" w:color="auto" w:val="clear"/>
+            <w:tcMar>
+              <w:top w:type="dxa" w:w="70"/>
+              <w:left w:type="dxa" w:w="100"/>
+              <w:bottom w:type="dxa" w:w="70"/>
+              <w:right w:type="dxa" w:w="100"/>
+            </w:tcMar>
+            <w:vAlign w:val="top"/>
+          </w:tcPr>
+          <w:p>
+            <w:pPr>
+              <w:spacing w:after="40" w:line="264"/>
+              <w:jc w:val="center"/>
+            </w:pPr>
+            <w:r>
+              <w:rPr>
+                <w:b w:val="false"/>
+                <w:bCs w:val="false"/>
+                <w:sz w:val="19"/>
+                <w:szCs w:val="19"/>
+              </w:rPr>
+              <w:t xml:space="preserve">✔ (үндсэн тэмдэг)</w:t>
+            </w:r>
+          </w:p>
+        </w:tc>
+        <w:tc>
+          <w:tcPr>
+            <w:tcW w:type="dxa" w:w="2038"/>
+            <w:tcBorders>
+              <w:top w:val="single" w:color="A9B1BD" w:sz="4"/>
+              <w:left w:val="single" w:color="A9B1BD" w:sz="4"/>
+              <w:bottom w:val="single" w:color="A9B1BD" w:sz="4"/>
+              <w:right w:val="single" w:color="A9B1BD" w:sz="4"/>
+            </w:tcBorders>
+            <w:shd w:fill="F7F8FA" w:color="auto" w:val="clear"/>
+            <w:tcMar>
+              <w:top w:type="dxa" w:w="70"/>
+              <w:left w:type="dxa" w:w="100"/>
+              <w:bottom w:type="dxa" w:w="70"/>
+              <w:right w:type="dxa" w:w="100"/>
+            </w:tcMar>
+            <w:vAlign w:val="top"/>
+          </w:tcPr>
+          <w:p>
+            <w:pPr>
+              <w:spacing w:after="40" w:line="264"/>
+              <w:jc w:val="center"/>
+            </w:pPr>
+            <w:r>
+              <w:rPr>
+                <w:b w:val="false"/>
+                <w:bCs w:val="false"/>
+                <w:sz w:val="19"/>
+                <w:szCs w:val="19"/>
+              </w:rPr>
+              <w:t xml:space="preserve">—</w:t>
+            </w:r>
+          </w:p>
+        </w:tc>
+      </w:tr>
+      <w:tr>
+        <w:trPr>
+          <w:cantSplit/>
+        </w:trPr>
+        <w:tc>
+          <w:tcPr>
+            <w:tcW w:type="dxa" w:w="3600"/>
+            <w:tcBorders>
+              <w:top w:val="single" w:color="A9B1BD" w:sz="4"/>
+              <w:left w:val="single" w:color="A9B1BD" w:sz="4"/>
+              <w:bottom w:val="single" w:color="A9B1BD" w:sz="4"/>
+              <w:right w:val="single" w:color="A9B1BD" w:sz="4"/>
+            </w:tcBorders>
+            <w:tcMar>
+              <w:top w:type="dxa" w:w="70"/>
+              <w:left w:type="dxa" w:w="100"/>
+              <w:bottom w:type="dxa" w:w="70"/>
+              <w:right w:type="dxa" w:w="100"/>
+            </w:tcMar>
+            <w:vAlign w:val="top"/>
+          </w:tcPr>
+          <w:p>
+            <w:pPr>
+              <w:spacing w:after="40" w:line="264"/>
+              <w:jc w:val="left"/>
+            </w:pPr>
+            <w:r>
+              <w:rPr>
+                <w:b/>
+                <w:bCs/>
+                <w:sz w:val="19"/>
+                <w:szCs w:val="19"/>
+              </w:rPr>
               <w:t xml:space="preserve">Төгсөлтийн гавьяаны тэмдэг</w:t>
             </w:r>
           </w:p>
@@ -11304,7 +11621,6 @@
               <w:bottom w:val="single" w:color="A9B1BD" w:sz="4"/>
               <w:right w:val="single" w:color="A9B1BD" w:sz="4"/>
             </w:tcBorders>
-            <w:shd w:fill="F7F8FA" w:color="auto" w:val="clear"/>
             <w:tcMar>
               <w:top w:type="dxa" w:w="70"/>
               <w:left w:type="dxa" w:w="100"/>
@@ -11338,7 +11654,6 @@
               <w:bottom w:val="single" w:color="A9B1BD" w:sz="4"/>
               <w:right w:val="single" w:color="A9B1BD" w:sz="4"/>
             </w:tcBorders>
-            <w:shd w:fill="F7F8FA" w:color="auto" w:val="clear"/>
             <w:tcMar>
               <w:top w:type="dxa" w:w="70"/>
               <w:left w:type="dxa" w:w="100"/>
@@ -11372,7 +11687,6 @@
               <w:bottom w:val="single" w:color="A9B1BD" w:sz="4"/>
               <w:right w:val="single" w:color="A9B1BD" w:sz="4"/>
             </w:tcBorders>
-            <w:shd w:fill="F7F8FA" w:color="auto" w:val="clear"/>
             <w:tcMar>
               <w:top w:type="dxa" w:w="70"/>
               <w:left w:type="dxa" w:w="100"/>
@@ -11570,7 +11884,7 @@
                 <w:sz w:val="19"/>
                 <w:szCs w:val="19"/>
               </w:rPr>
-              <w:t xml:space="preserve">Төгсөлтийн гавьяаны тэмдэг (зөвхөн төгсөлтийн ёслолд)</w:t>
+              <w:t xml:space="preserve">Д.Сүхбаатар жанжны нэрэмжит шагналын тэмдэг</w:t>
             </w:r>
           </w:p>
         </w:tc>
@@ -11641,7 +11955,7 @@
                 <w:sz w:val="19"/>
                 <w:szCs w:val="19"/>
               </w:rPr>
-              <w:t xml:space="preserve">Хорооны ахлах сонсогч асны тэмдэг</w:t>
+              <w:t xml:space="preserve">Төгсөлтийн гавьяаны тэмдэг (зөвхөн төгсөлтийн ёслолд)</w:t>
             </w:r>
           </w:p>
         </w:tc>
@@ -11710,7 +12024,7 @@
                 <w:sz w:val="19"/>
                 <w:szCs w:val="19"/>
               </w:rPr>
-              <w:t xml:space="preserve">Шилдэг сонсогч удирдагчийн тэмдэг</w:t>
+              <w:t xml:space="preserve">Хорооны ахлах сонсогч асны тэмдэг</w:t>
             </w:r>
           </w:p>
         </w:tc>
@@ -11781,7 +12095,7 @@
                 <w:sz w:val="19"/>
                 <w:szCs w:val="19"/>
               </w:rPr>
-              <w:t xml:space="preserve">Нэр төрийн тэмдэг</w:t>
+              <w:t xml:space="preserve">Шилдэг сонсогч удирдагчийн тэмдэг</w:t>
             </w:r>
           </w:p>
         </w:tc>
@@ -11850,7 +12164,7 @@
                 <w:sz w:val="19"/>
                 <w:szCs w:val="19"/>
               </w:rPr>
-              <w:t xml:space="preserve">Эх оронч сонсогчийн тэмдэг</w:t>
+              <w:t xml:space="preserve">Нэр төрийн тэмдэг</w:t>
             </w:r>
           </w:p>
         </w:tc>
@@ -11921,7 +12235,7 @@
                 <w:sz w:val="19"/>
                 <w:szCs w:val="19"/>
               </w:rPr>
-              <w:t xml:space="preserve">Семестрийн жагсаалтын тэмдэг (Захирлын → Эрдмийн → Удирдах → Бие бялдрын)</w:t>
+              <w:t xml:space="preserve">Эх оронч сонсогчийн тэмдэг</w:t>
             </w:r>
           </w:p>
         </w:tc>
@@ -11970,6 +12284,77 @@
               <w:bottom w:val="single" w:color="A9B1BD" w:sz="4"/>
               <w:right w:val="single" w:color="A9B1BD" w:sz="4"/>
             </w:tcBorders>
+            <w:tcMar>
+              <w:top w:type="dxa" w:w="70"/>
+              <w:left w:type="dxa" w:w="100"/>
+              <w:bottom w:type="dxa" w:w="70"/>
+              <w:right w:type="dxa" w:w="100"/>
+            </w:tcMar>
+            <w:vAlign w:val="top"/>
+          </w:tcPr>
+          <w:p>
+            <w:pPr>
+              <w:spacing w:after="40" w:line="264"/>
+              <w:jc w:val="left"/>
+            </w:pPr>
+            <w:r>
+              <w:rPr>
+                <w:b w:val="false"/>
+                <w:bCs w:val="false"/>
+                <w:sz w:val="19"/>
+                <w:szCs w:val="19"/>
+              </w:rPr>
+              <w:t xml:space="preserve">Семестрийн жагсаалтын тэмдэг (Захирлын → Эрдмийн → Удирдах → Бие бялдрын)</w:t>
+            </w:r>
+          </w:p>
+        </w:tc>
+      </w:tr>
+      <w:tr>
+        <w:trPr>
+          <w:cantSplit/>
+        </w:trPr>
+        <w:tc>
+          <w:tcPr>
+            <w:tcW w:type="dxa" w:w="1200"/>
+            <w:tcBorders>
+              <w:top w:val="single" w:color="A9B1BD" w:sz="4"/>
+              <w:left w:val="single" w:color="A9B1BD" w:sz="4"/>
+              <w:bottom w:val="single" w:color="A9B1BD" w:sz="4"/>
+              <w:right w:val="single" w:color="A9B1BD" w:sz="4"/>
+            </w:tcBorders>
+            <w:shd w:fill="F7F8FA" w:color="auto" w:val="clear"/>
+            <w:tcMar>
+              <w:top w:type="dxa" w:w="70"/>
+              <w:left w:type="dxa" w:w="100"/>
+              <w:bottom w:type="dxa" w:w="70"/>
+              <w:right w:type="dxa" w:w="100"/>
+            </w:tcMar>
+            <w:vAlign w:val="top"/>
+          </w:tcPr>
+          <w:p>
+            <w:pPr>
+              <w:spacing w:after="40" w:line="264"/>
+              <w:jc w:val="center"/>
+            </w:pPr>
+            <w:r>
+              <w:rPr>
+                <w:sz w:val="19"/>
+                <w:szCs w:val="19"/>
+              </w:rPr>
+              <w:t xml:space="preserve">8</w:t>
+            </w:r>
+          </w:p>
+        </w:tc>
+        <w:tc>
+          <w:tcPr>
+            <w:tcW w:type="dxa" w:w="8438"/>
+            <w:tcBorders>
+              <w:top w:val="single" w:color="A9B1BD" w:sz="4"/>
+              <w:left w:val="single" w:color="A9B1BD" w:sz="4"/>
+              <w:bottom w:val="single" w:color="A9B1BD" w:sz="4"/>
+              <w:right w:val="single" w:color="A9B1BD" w:sz="4"/>
+            </w:tcBorders>
+            <w:shd w:fill="F7F8FA" w:color="auto" w:val="clear"/>
             <w:tcMar>
               <w:top w:type="dxa" w:w="70"/>
               <w:left w:type="dxa" w:w="100"/>
@@ -14916,7 +15301,7 @@
         </w:rPr>
         <w:t xml:space="preserve">Navy Online — Midshipman ranks (stripes). </w:t>
       </w:r>
-      <w:hyperlink w:history="1" r:id="rIdi1135utkg_ji6lb5s0emx">
+      <w:hyperlink w:history="1" r:id="rIdqduzh02olj6cpouszk-_x">
         <w:r>
           <w:rPr>
             <w:rStyle w:val="Hyperlink"/>
@@ -14943,7 +15328,7 @@
         </w:rPr>
         <w:t xml:space="preserve">Navy Online — Brigade Commander. </w:t>
       </w:r>
-      <w:hyperlink w:history="1" r:id="rIdsfswpjkcz0e02wkoywnnc">
+      <w:hyperlink w:history="1" r:id="rIdcxnh0mp7tkvgx9munmft9">
         <w:r>
           <w:rPr>
             <w:rStyle w:val="Hyperlink"/>
@@ -14970,7 +15355,7 @@
         </w:rPr>
         <w:t xml:space="preserve">USNA — Fall 2023 Brigade Commander. </w:t>
       </w:r>
-      <w:hyperlink w:history="1" r:id="rIdbfyqarl7wqxc4qj3limjg">
+      <w:hyperlink w:history="1" r:id="rIduhh0gjic1d8cbwtsicenl">
         <w:r>
           <w:rPr>
             <w:rStyle w:val="Hyperlink"/>
@@ -14997,7 +15382,7 @@
         </w:rPr>
         <w:t xml:space="preserve">USNA — Naval Academy Announces Color Company (2018). </w:t>
       </w:r>
-      <w:hyperlink w:history="1" r:id="rIdd5cgjgggzdi0wlf2gvxgx">
+      <w:hyperlink w:history="1" r:id="rIdnh_4zjh0qwrugwztnukd5">
         <w:r>
           <w:rPr>
             <w:rStyle w:val="Hyperlink"/>
@@ -15024,7 +15409,7 @@
         </w:rPr>
         <w:t xml:space="preserve">DTIC — A Validity Review of the Color Company Competition at USNA. </w:t>
       </w:r>
-      <w:hyperlink w:history="1" r:id="rIdwk0uvrcqdtxbapapvxyqe">
+      <w:hyperlink w:history="1" r:id="rIdvsrjzoq4v5xf0xp_tdpr5">
         <w:r>
           <w:rPr>
             <w:rStyle w:val="Hyperlink"/>
@@ -15051,7 +15436,7 @@
         </w:rPr>
         <w:t xml:space="preserve">USAFA — The Contrails: Cadet insignia, badges. </w:t>
       </w:r>
-      <w:hyperlink w:history="1" r:id="rIdd89w_sis6bqwpollamhni">
+      <w:hyperlink w:history="1" r:id="rIddpqs0g8fiy53fc4uw6kzq">
         <w:r>
           <w:rPr>
             <w:rStyle w:val="Hyperlink"/>
@@ -15078,7 +15463,7 @@
         </w:rPr>
         <w:t xml:space="preserve">USAFA Instruction 36-3510. </w:t>
       </w:r>
-      <w:hyperlink w:history="1" r:id="rIdddp6xxy6qzbrd8svee2r-">
+      <w:hyperlink w:history="1" r:id="rIddmpznauyahnowwn0y3x13">
         <w:r>
           <w:rPr>
             <w:rStyle w:val="Hyperlink"/>
@@ -15105,7 +15490,7 @@
         </w:rPr>
         <w:t xml:space="preserve">USAFA Cadet Insignia (Wikipedia). </w:t>
       </w:r>
-      <w:hyperlink w:history="1" r:id="rIdqdeahosk6cekrxy9pkeci">
+      <w:hyperlink w:history="1" r:id="rIdolvw4izozjbnp_nz32fdf">
         <w:r>
           <w:rPr>
             <w:rStyle w:val="Hyperlink"/>
@@ -15132,7 +15517,7 @@
         </w:rPr>
         <w:t xml:space="preserve">Naval History and Heritage Command — Chevrons. </w:t>
       </w:r>
-      <w:hyperlink w:history="1" r:id="rIdjiuuuup7dbhu6qb3orusf">
+      <w:hyperlink w:history="1" r:id="rId69u2ykva_ilzlsfkuffri">
         <w:r>
           <w:rPr>
             <w:rStyle w:val="Hyperlink"/>
@@ -15159,7 +15544,7 @@
         </w:rPr>
         <w:t xml:space="preserve">List of USMA First Captains (Wikipedia). </w:t>
       </w:r>
-      <w:hyperlink w:history="1" r:id="rIdqb92yw3nrxb1u2c1gsexc">
+      <w:hyperlink w:history="1" r:id="rIdpyqvwynfmqjc6c1hc_wke">
         <w:r>
           <w:rPr>
             <w:rStyle w:val="Hyperlink"/>
@@ -15186,7 +15571,7 @@
         </w:rPr>
         <w:t xml:space="preserve">e-Veritas — CWC Fall Term 2008. </w:t>
       </w:r>
-      <w:hyperlink w:history="1" r:id="rIdiwu8irbzojel9mbg9atzg">
+      <w:hyperlink w:history="1" r:id="rId7uol9arwydh7f5jses1kt">
         <w:r>
           <w:rPr>
             <w:rStyle w:val="Hyperlink"/>
@@ -15213,7 +15598,7 @@
         </w:rPr>
         <w:t xml:space="preserve">Commonwealth Oral Histories — Sword of Honour. </w:t>
       </w:r>
-      <w:hyperlink w:history="1" r:id="rId8klz7vofwn4jsrhyzb5th">
+      <w:hyperlink w:history="1" r:id="rIdsisgz2mav_6lioelcfys8">
         <w:r>
           <w:rPr>
             <w:rStyle w:val="Hyperlink"/>
@@ -15240,7 +15625,7 @@
         </w:rPr>
         <w:t xml:space="preserve">Forces News — Journey to winning the Sword of Honour. </w:t>
       </w:r>
-      <w:hyperlink w:history="1" r:id="rIdwti69omzeflxbz7uq6l99">
+      <w:hyperlink w:history="1" r:id="rIdsldf0qhunqod88yjvgpwo">
         <w:r>
           <w:rPr>
             <w:rStyle w:val="Hyperlink"/>
@@ -15267,7 +15652,7 @@
         </w:rPr>
         <w:t xml:space="preserve">News On AIR — NDA 146th Passing Out Parade. </w:t>
       </w:r>
-      <w:hyperlink w:history="1" r:id="rIdvskrfpozzirfghpsw9cfk">
+      <w:hyperlink w:history="1" r:id="rIds9grcohvnd1zilo8e9csb">
         <w:r>
           <w:rPr>
             <w:rStyle w:val="Hyperlink"/>
@@ -15294,7 +15679,7 @@
         </w:rPr>
         <w:t xml:space="preserve">Ministry of Defence (India) — Khadakwasla reviews. </w:t>
       </w:r>
-      <w:hyperlink w:history="1" r:id="rIdhanzbibanwuo6t0j9fp8l">
+      <w:hyperlink w:history="1" r:id="rIdyi9hrwzfoxkbfszgb8ote">
         <w:r>
           <w:rPr>
             <w:rStyle w:val="Hyperlink"/>
@@ -15321,7 +15706,7 @@
         </w:rPr>
         <w:t xml:space="preserve">ОХУ-ын БХЯ-ны тушаал (курсантын тэмдэг). </w:t>
       </w:r>
-      <w:hyperlink w:history="1" r:id="rIdad8xg7u31rc55avlqltwq">
+      <w:hyperlink w:history="1" r:id="rIdjujugfesmvmziet28yqsw">
         <w:r>
           <w:rPr>
             <w:rStyle w:val="Hyperlink"/>
@@ -15348,7 +15733,7 @@
         </w:rPr>
         <w:t xml:space="preserve">ФСБ-ийн тушаал (курсийн ханцуйн тэмдэг). </w:t>
       </w:r>
-      <w:hyperlink w:history="1" r:id="rId3e5m0zqdvykoxxg_aggwb">
+      <w:hyperlink w:history="1" r:id="rIdpxeyrqq1msjyf2ao2norw">
         <w:r>
           <w:rPr>
             <w:rStyle w:val="Hyperlink"/>
@@ -15375,7 +15760,7 @@
         </w:rPr>
         <w:t xml:space="preserve">Legalinfo — Цэргийн дүрэмт хувцас, цол, ялгах тэмдгийн загварыг батлах тухай. </w:t>
       </w:r>
-      <w:hyperlink w:history="1" r:id="rIdpmwnnsbvci5waq1ztn6mq">
+      <w:hyperlink w:history="1" r:id="rIdporwwkd0wc6gkwmktphwx">
         <w:r>
           <w:rPr>
             <w:rStyle w:val="Hyperlink"/>
@@ -15402,7 +15787,7 @@
         </w:rPr>
         <w:t xml:space="preserve">Legalinfo — Цэргийн алба хаагчдын хувцас, хэрэглэлийн норм. </w:t>
       </w:r>
-      <w:hyperlink w:history="1" r:id="rIdzyf8fyj1kjvj90ndzlien">
+      <w:hyperlink w:history="1" r:id="rIdybkp-s7_03fr4mjgffjep">
         <w:r>
           <w:rPr>
             <w:rStyle w:val="Hyperlink"/>
@@ -15429,7 +15814,7 @@
         </w:rPr>
         <w:t xml:space="preserve">Ikon.mn — Монгол цэргийн дүрэмт хувцасны түүх (2017). </w:t>
       </w:r>
-      <w:hyperlink w:history="1" r:id="rIdlv_g1yye9ke50yxt0zjel">
+      <w:hyperlink w:history="1" r:id="rIdmj9jpscgvctpxyb1hwhs7">
         <w:r>
           <w:rPr>
             <w:rStyle w:val="Hyperlink"/>
@@ -15456,7 +15841,7 @@
         </w:rPr>
         <w:t xml:space="preserve">防衛大学校 — 学生生活 (Японы академийн сонсогчийн амьдрал). </w:t>
       </w:r>
-      <w:hyperlink w:history="1" r:id="rId2tcizoinfqlsfsea0vslq">
+      <w:hyperlink w:history="1" r:id="rIds6rpan5dfrrj2hf3qku_g">
         <w:r>
           <w:rPr>
             <w:rStyle w:val="Hyperlink"/>

</xml_diff>